<commit_message>
Standardize project approval status taxonomy
</commit_message>
<xml_diff>
--- a/STARLAB_Unit_2/Teaching Guides/Week 4/Week 4 - Formal Research Plan Safety Ethics and Approval.docx
+++ b/STARLAB_Unit_2/Teaching Guides/Week 4/Week 4 - Formal Research Plan Safety Ethics and Approval.docx
@@ -1777,13 +1777,13 @@
         <w:rPr>
           <w:rtl w:val="0"/>
         </w:rPr>
-        <w:t xml:space="preserve">Possible approval outcomes:</w:t>
+        <w:t>Possible Week 4 decision statuses:</w:t>
       </w:r>
     </w:p>
     <w:p>
       <w:pPr/>
       <w:r>
-        <w:t>Use exactly one status from the Project Approval Tracker. The tracker is the official approval record.</w:t>
+        <w:t>Use exactly one applicable status from the Project Approval Tracker. These are the Week 4 decision options; the tracker also contains workflow-only states and the later Approved for Systematic Data Collection status.</w:t>
       </w:r>
     </w:p>
     <w:p>
@@ -1819,6 +1819,12 @@
       </w:r>
     </w:p>
     <w:p>
+      <w:pPr/>
+      <w:r>
+        <w:t>Needs Revision</w:t>
+      </w:r>
+    </w:p>
+    <w:p>
       <w:pPr>
         <w:numPr>
           <w:ilvl w:val="0"/>
@@ -1880,6 +1886,12 @@
           <w:rtl w:val="0"/>
         </w:rPr>
         <w:t>Not Approved in Current Form</w:t>
+      </w:r>
+    </w:p>
+    <w:p>
+      <w:pPr/>
+      <w:r>
+        <w:t>Only Approved for Pilot Testing permits the approved small-scale pilot. Approved With Modifications and all Needs/Not Approved statuses do not authorize testing.</w:t>
       </w:r>
     </w:p>
     <w:p>

</xml_diff>